<commit_message>
Lots of updates to Task 1
</commit_message>
<xml_diff>
--- a/WRIT-1 Document/DAT5004-S2_24-WRIT1-TomRowan-ST20285213.docx
+++ b/WRIT-1 Document/DAT5004-S2_24-WRIT1-TomRowan-ST20285213.docx
@@ -18,7 +18,7 @@
         <w:pStyle w:val="Heading1"/>
       </w:pPr>
       <w:bookmarkStart w:id="1" w:name="_Toc155876009"/>
-      <w:bookmarkStart w:id="2" w:name="_Toc198717927"/>
+      <w:bookmarkStart w:id="2" w:name="_Toc198761991"/>
       <w:r>
         <w:t>Course Details</w:t>
       </w:r>
@@ -117,7 +117,7 @@
       <w:pPr>
         <w:pStyle w:val="Heading1"/>
       </w:pPr>
-      <w:bookmarkStart w:id="3" w:name="_Toc198717928"/>
+      <w:bookmarkStart w:id="3" w:name="_Toc198761992"/>
       <w:r>
         <w:t>Student</w:t>
       </w:r>
@@ -168,7 +168,7 @@
         <w:pStyle w:val="Heading1"/>
       </w:pPr>
       <w:bookmarkStart w:id="4" w:name="_Toc155876011"/>
-      <w:bookmarkStart w:id="5" w:name="_Toc198717929"/>
+      <w:bookmarkStart w:id="5" w:name="_Toc198761993"/>
       <w:r>
         <w:t>Project Tutor</w:t>
       </w:r>
@@ -275,7 +275,7 @@
             </w:rPr>
             <w:fldChar w:fldCharType="separate"/>
           </w:r>
-          <w:hyperlink w:anchor="_Toc198717927" w:history="1">
+          <w:hyperlink w:anchor="_Toc198761991" w:history="1">
             <w:r>
               <w:rPr>
                 <w:rStyle w:val="Hyperlink"/>
@@ -302,7 +302,7 @@
                 <w:noProof/>
                 <w:webHidden/>
               </w:rPr>
-              <w:instrText xml:space="preserve"> PAGEREF _Toc198717927 \h </w:instrText>
+              <w:instrText xml:space="preserve"> PAGEREF _Toc198761991 \h </w:instrText>
             </w:r>
             <w:r>
               <w:rPr>
@@ -349,7 +349,7 @@
               <w:lang w:eastAsia="en-GB"/>
             </w:rPr>
           </w:pPr>
-          <w:hyperlink w:anchor="_Toc198717928" w:history="1">
+          <w:hyperlink w:anchor="_Toc198761992" w:history="1">
             <w:r>
               <w:rPr>
                 <w:rStyle w:val="Hyperlink"/>
@@ -376,7 +376,7 @@
                 <w:noProof/>
                 <w:webHidden/>
               </w:rPr>
-              <w:instrText xml:space="preserve"> PAGEREF _Toc198717928 \h </w:instrText>
+              <w:instrText xml:space="preserve"> PAGEREF _Toc198761992 \h </w:instrText>
             </w:r>
             <w:r>
               <w:rPr>
@@ -423,7 +423,7 @@
               <w:lang w:eastAsia="en-GB"/>
             </w:rPr>
           </w:pPr>
-          <w:hyperlink w:anchor="_Toc198717929" w:history="1">
+          <w:hyperlink w:anchor="_Toc198761993" w:history="1">
             <w:r>
               <w:rPr>
                 <w:rStyle w:val="Hyperlink"/>
@@ -450,7 +450,7 @@
                 <w:noProof/>
                 <w:webHidden/>
               </w:rPr>
-              <w:instrText xml:space="preserve"> PAGEREF _Toc198717929 \h </w:instrText>
+              <w:instrText xml:space="preserve"> PAGEREF _Toc198761993 \h </w:instrText>
             </w:r>
             <w:r>
               <w:rPr>
@@ -497,7 +497,7 @@
               <w:lang w:eastAsia="en-GB"/>
             </w:rPr>
           </w:pPr>
-          <w:hyperlink w:anchor="_Toc198717930" w:history="1">
+          <w:hyperlink w:anchor="_Toc198761994" w:history="1">
             <w:r>
               <w:rPr>
                 <w:rStyle w:val="Hyperlink"/>
@@ -524,7 +524,7 @@
                 <w:noProof/>
                 <w:webHidden/>
               </w:rPr>
-              <w:instrText xml:space="preserve"> PAGEREF _Toc198717930 \h </w:instrText>
+              <w:instrText xml:space="preserve"> PAGEREF _Toc198761994 \h </w:instrText>
             </w:r>
             <w:r>
               <w:rPr>
@@ -571,7 +571,7 @@
               <w:lang w:eastAsia="en-GB"/>
             </w:rPr>
           </w:pPr>
-          <w:hyperlink w:anchor="_Toc198717931" w:history="1">
+          <w:hyperlink w:anchor="_Toc198761995" w:history="1">
             <w:r>
               <w:rPr>
                 <w:rStyle w:val="Hyperlink"/>
@@ -598,7 +598,7 @@
                 <w:noProof/>
                 <w:webHidden/>
               </w:rPr>
-              <w:instrText xml:space="preserve"> PAGEREF _Toc198717931 \h </w:instrText>
+              <w:instrText xml:space="preserve"> PAGEREF _Toc198761995 \h </w:instrText>
             </w:r>
             <w:r>
               <w:rPr>
@@ -645,7 +645,7 @@
               <w:lang w:eastAsia="en-GB"/>
             </w:rPr>
           </w:pPr>
-          <w:hyperlink w:anchor="_Toc198717932" w:history="1">
+          <w:hyperlink w:anchor="_Toc198761996" w:history="1">
             <w:r>
               <w:rPr>
                 <w:rStyle w:val="Hyperlink"/>
@@ -672,7 +672,7 @@
                 <w:noProof/>
                 <w:webHidden/>
               </w:rPr>
-              <w:instrText xml:space="preserve"> PAGEREF _Toc198717932 \h </w:instrText>
+              <w:instrText xml:space="preserve"> PAGEREF _Toc198761996 \h </w:instrText>
             </w:r>
             <w:r>
               <w:rPr>
@@ -719,7 +719,7 @@
               <w:lang w:eastAsia="en-GB"/>
             </w:rPr>
           </w:pPr>
-          <w:hyperlink w:anchor="_Toc198717933" w:history="1">
+          <w:hyperlink w:anchor="_Toc198761997" w:history="1">
             <w:r>
               <w:rPr>
                 <w:rStyle w:val="Hyperlink"/>
@@ -746,7 +746,7 @@
                 <w:noProof/>
                 <w:webHidden/>
               </w:rPr>
-              <w:instrText xml:space="preserve"> PAGEREF _Toc198717933 \h </w:instrText>
+              <w:instrText xml:space="preserve"> PAGEREF _Toc198761997 \h </w:instrText>
             </w:r>
             <w:r>
               <w:rPr>
@@ -793,7 +793,7 @@
               <w:lang w:eastAsia="en-GB"/>
             </w:rPr>
           </w:pPr>
-          <w:hyperlink w:anchor="_Toc198717934" w:history="1">
+          <w:hyperlink w:anchor="_Toc198761998" w:history="1">
             <w:r>
               <w:rPr>
                 <w:rStyle w:val="Hyperlink"/>
@@ -820,7 +820,7 @@
                 <w:noProof/>
                 <w:webHidden/>
               </w:rPr>
-              <w:instrText xml:space="preserve"> PAGEREF _Toc198717934 \h </w:instrText>
+              <w:instrText xml:space="preserve"> PAGEREF _Toc198761998 \h </w:instrText>
             </w:r>
             <w:r>
               <w:rPr>
@@ -867,7 +867,7 @@
               <w:lang w:eastAsia="en-GB"/>
             </w:rPr>
           </w:pPr>
-          <w:hyperlink w:anchor="_Toc198717935" w:history="1">
+          <w:hyperlink w:anchor="_Toc198761999" w:history="1">
             <w:r>
               <w:rPr>
                 <w:rStyle w:val="Hyperlink"/>
@@ -894,7 +894,7 @@
                 <w:noProof/>
                 <w:webHidden/>
               </w:rPr>
-              <w:instrText xml:space="preserve"> PAGEREF _Toc198717935 \h </w:instrText>
+              <w:instrText xml:space="preserve"> PAGEREF _Toc198761999 \h </w:instrText>
             </w:r>
             <w:r>
               <w:rPr>
@@ -941,7 +941,7 @@
               <w:lang w:eastAsia="en-GB"/>
             </w:rPr>
           </w:pPr>
-          <w:hyperlink w:anchor="_Toc198717936" w:history="1">
+          <w:hyperlink w:anchor="_Toc198762000" w:history="1">
             <w:r>
               <w:rPr>
                 <w:rStyle w:val="Hyperlink"/>
@@ -968,7 +968,7 @@
                 <w:noProof/>
                 <w:webHidden/>
               </w:rPr>
-              <w:instrText xml:space="preserve"> PAGEREF _Toc198717936 \h </w:instrText>
+              <w:instrText xml:space="preserve"> PAGEREF _Toc198762000 \h </w:instrText>
             </w:r>
             <w:r>
               <w:rPr>
@@ -1015,7 +1015,7 @@
               <w:lang w:eastAsia="en-GB"/>
             </w:rPr>
           </w:pPr>
-          <w:hyperlink w:anchor="_Toc198717937" w:history="1">
+          <w:hyperlink w:anchor="_Toc198762001" w:history="1">
             <w:r>
               <w:rPr>
                 <w:rStyle w:val="Hyperlink"/>
@@ -1042,7 +1042,7 @@
                 <w:noProof/>
                 <w:webHidden/>
               </w:rPr>
-              <w:instrText xml:space="preserve"> PAGEREF _Toc198717937 \h </w:instrText>
+              <w:instrText xml:space="preserve"> PAGEREF _Toc198762001 \h </w:instrText>
             </w:r>
             <w:r>
               <w:rPr>
@@ -1089,7 +1089,7 @@
               <w:lang w:eastAsia="en-GB"/>
             </w:rPr>
           </w:pPr>
-          <w:hyperlink w:anchor="_Toc198717938" w:history="1">
+          <w:hyperlink w:anchor="_Toc198762002" w:history="1">
             <w:r>
               <w:rPr>
                 <w:rStyle w:val="Hyperlink"/>
@@ -1116,7 +1116,7 @@
                 <w:noProof/>
                 <w:webHidden/>
               </w:rPr>
-              <w:instrText xml:space="preserve"> PAGEREF _Toc198717938 \h </w:instrText>
+              <w:instrText xml:space="preserve"> PAGEREF _Toc198762002 \h </w:instrText>
             </w:r>
             <w:r>
               <w:rPr>
@@ -1163,7 +1163,7 @@
               <w:lang w:eastAsia="en-GB"/>
             </w:rPr>
           </w:pPr>
-          <w:hyperlink w:anchor="_Toc198717939" w:history="1">
+          <w:hyperlink w:anchor="_Toc198762003" w:history="1">
             <w:r>
               <w:rPr>
                 <w:rStyle w:val="Hyperlink"/>
@@ -1190,7 +1190,7 @@
                 <w:noProof/>
                 <w:webHidden/>
               </w:rPr>
-              <w:instrText xml:space="preserve"> PAGEREF _Toc198717939 \h </w:instrText>
+              <w:instrText xml:space="preserve"> PAGEREF _Toc198762003 \h </w:instrText>
             </w:r>
             <w:r>
               <w:rPr>
@@ -1251,7 +1251,7 @@
       <w:pPr>
         <w:pStyle w:val="Heading1"/>
       </w:pPr>
-      <w:bookmarkStart w:id="6" w:name="_Toc198717930"/>
+      <w:bookmarkStart w:id="6" w:name="_Toc198761994"/>
       <w:r>
         <w:lastRenderedPageBreak/>
         <w:t>Task 1</w:t>
@@ -1277,7 +1277,7 @@
       <w:pPr>
         <w:pStyle w:val="Heading2"/>
       </w:pPr>
-      <w:bookmarkStart w:id="7" w:name="_Toc198717931"/>
+      <w:bookmarkStart w:id="7" w:name="_Toc198761995"/>
       <w:r>
         <w:t>Task 1.1</w:t>
       </w:r>
@@ -1648,7 +1648,7 @@
       <w:pPr>
         <w:pStyle w:val="Heading2"/>
       </w:pPr>
-      <w:bookmarkStart w:id="8" w:name="_Toc198717932"/>
+      <w:bookmarkStart w:id="8" w:name="_Toc198761996"/>
       <w:r>
         <w:lastRenderedPageBreak/>
         <w:t>Task 1.2</w:t>
@@ -2251,7 +2251,7 @@
       <w:pPr>
         <w:pStyle w:val="Heading2"/>
       </w:pPr>
-      <w:bookmarkStart w:id="9" w:name="_Toc198717933"/>
+      <w:bookmarkStart w:id="9" w:name="_Toc198761997"/>
       <w:r>
         <w:lastRenderedPageBreak/>
         <w:t>Task 1.3</w:t>
@@ -2341,7 +2341,7 @@
       <w:pPr>
         <w:pStyle w:val="Heading2"/>
       </w:pPr>
-      <w:bookmarkStart w:id="10" w:name="_Toc198717934"/>
+      <w:bookmarkStart w:id="10" w:name="_Toc198761998"/>
       <w:r>
         <w:t>Task 1.4</w:t>
       </w:r>
@@ -2694,7 +2694,7 @@
       <w:pPr>
         <w:pStyle w:val="Heading1"/>
       </w:pPr>
-      <w:bookmarkStart w:id="11" w:name="_Toc198717935"/>
+      <w:bookmarkStart w:id="11" w:name="_Toc198761999"/>
       <w:r>
         <w:lastRenderedPageBreak/>
         <w:t>Task 2</w:t>
@@ -2708,7 +2708,7 @@
       <w:pPr>
         <w:pStyle w:val="Heading2"/>
       </w:pPr>
-      <w:bookmarkStart w:id="12" w:name="_Toc198717936"/>
+      <w:bookmarkStart w:id="12" w:name="_Toc198762000"/>
       <w:r>
         <w:t>Task One – Website Scraping</w:t>
       </w:r>
@@ -2785,16 +2785,16 @@
         <w:t>scraped</w:t>
       </w:r>
       <w:r>
-        <w:t xml:space="preserve"> all </w:t>
-      </w:r>
-      <w:r>
-        <w:rPr>
-          <w:highlight w:val="yellow"/>
-        </w:rPr>
-        <w:t>NNNN</w:t>
-      </w:r>
-      <w:r>
-        <w:t xml:space="preserve"> movies</w:t>
+        <w:t xml:space="preserve"> </w:t>
+      </w:r>
+      <w:r>
+        <w:t>57501</w:t>
+      </w:r>
+      <w:r>
+        <w:t xml:space="preserve"> </w:t>
+      </w:r>
+      <w:r>
+        <w:t>movies</w:t>
       </w:r>
       <w:r>
         <w:t xml:space="preserve">, </w:t>
@@ -2806,9 +2806,6 @@
         <w:t xml:space="preserve">approximately </w:t>
       </w:r>
       <w:r>
-        <w:rPr>
-          <w:highlight w:val="yellow"/>
-        </w:rPr>
         <w:t>eight</w:t>
       </w:r>
       <w:r>
@@ -2885,7 +2882,7 @@
       <w:pPr>
         <w:pStyle w:val="Heading2"/>
       </w:pPr>
-      <w:bookmarkStart w:id="13" w:name="_Toc198717937"/>
+      <w:bookmarkStart w:id="13" w:name="_Toc198762001"/>
       <w:r>
         <w:t>Task Two</w:t>
       </w:r>
@@ -2976,7 +2973,7 @@
       <w:pPr>
         <w:pStyle w:val="Heading2"/>
       </w:pPr>
-      <w:bookmarkStart w:id="14" w:name="_Toc198717938"/>
+      <w:bookmarkStart w:id="14" w:name="_Toc198762002"/>
       <w:r>
         <w:t>Task Three</w:t>
       </w:r>
@@ -3071,7 +3068,21 @@
           <w:i/>
           <w:iCs/>
         </w:rPr>
-        <w:t>(399 words)</w:t>
+        <w:t>(</w:t>
+      </w:r>
+      <w:r>
+        <w:rPr>
+          <w:i/>
+          <w:iCs/>
+        </w:rPr>
+        <w:t>402</w:t>
+      </w:r>
+      <w:r>
+        <w:rPr>
+          <w:i/>
+          <w:iCs/>
+        </w:rPr>
+        <w:t xml:space="preserve"> words)</w:t>
       </w:r>
     </w:p>
     <w:p>
@@ -3083,7 +3094,7 @@
       <w:pPr>
         <w:pStyle w:val="Heading1"/>
       </w:pPr>
-      <w:bookmarkStart w:id="15" w:name="_Toc198717939"/>
+      <w:bookmarkStart w:id="15" w:name="_Toc198762003"/>
       <w:r>
         <w:lastRenderedPageBreak/>
         <w:t>References</w:t>

</xml_diff>